<commit_message>
docs: Agregado evidencias clase 1 y 2
</commit_message>
<xml_diff>
--- a/docs/evidencias/clase-02/Evidencia_Clase_02_Diseno_Equipo08.docx.docx
+++ b/docs/evidencias/clase-02/Evidencia_Clase_02_Diseno_Equipo08.docx.docx
@@ -1902,94 +1902,6 @@
           </w:p>
         </w:tc>
       </w:tr>
-      <w:tr>
-        <w:trPr>
-          <w:cantSplit w:val="0"/>
-          <w:trHeight w:val="500" w:hRule="atLeast"/>
-          <w:tblHeader w:val="0"/>
-        </w:trPr>
-        <w:tc>
-          <w:tcPr>
-            <w:tcBorders>
-              <w:top w:color="000000" w:space="0" w:sz="6" w:val="single"/>
-              <w:left w:color="000000" w:space="0" w:sz="6" w:val="single"/>
-              <w:bottom w:color="000000" w:space="0" w:sz="6" w:val="single"/>
-              <w:right w:color="000000" w:space="0" w:sz="6" w:val="single"/>
-            </w:tcBorders>
-            <w:tcMar>
-              <w:top w:w="70.0" w:type="dxa"/>
-              <w:bottom w:w="70.0" w:type="dxa"/>
-            </w:tcMar>
-            <w:vAlign w:val="center"/>
-          </w:tcPr>
-          <w:p>
-            <w:pPr>
-              <w:spacing w:after="0" w:before="0" w:lineRule="auto"/>
-              <w:rPr>
-                <w:sz w:val="21"/>
-                <w:szCs w:val="21"/>
-              </w:rPr>
-            </w:pPr>
-            <w:r>
-              <w:rPr>
-                <w:rtl w:val="0"/>
-              </w:rPr>
-            </w:r>
-          </w:p>
-        </w:tc>
-        <w:tc>
-          <w:tcPr>
-            <w:tcBorders>
-              <w:top w:color="000000" w:space="0" w:sz="6" w:val="single"/>
-              <w:left w:color="000000" w:space="0" w:sz="6" w:val="single"/>
-              <w:bottom w:color="000000" w:space="0" w:sz="6" w:val="single"/>
-              <w:right w:color="000000" w:space="0" w:sz="6" w:val="single"/>
-            </w:tcBorders>
-            <w:tcMar>
-              <w:top w:w="70.0" w:type="dxa"/>
-              <w:bottom w:w="70.0" w:type="dxa"/>
-            </w:tcMar>
-            <w:vAlign w:val="center"/>
-          </w:tcPr>
-          <w:p>
-            <w:pPr>
-              <w:spacing w:after="0" w:before="0" w:lineRule="auto"/>
-              <w:rPr/>
-            </w:pPr>
-            <w:r>
-              <w:rPr>
-                <w:rtl w:val="0"/>
-              </w:rPr>
-            </w:r>
-          </w:p>
-        </w:tc>
-        <w:tc>
-          <w:tcPr>
-            <w:tcBorders>
-              <w:top w:color="000000" w:space="0" w:sz="6" w:val="single"/>
-              <w:left w:color="000000" w:space="0" w:sz="6" w:val="single"/>
-              <w:bottom w:color="000000" w:space="0" w:sz="6" w:val="single"/>
-              <w:right w:color="000000" w:space="0" w:sz="6" w:val="single"/>
-            </w:tcBorders>
-            <w:tcMar>
-              <w:top w:w="70.0" w:type="dxa"/>
-              <w:bottom w:w="70.0" w:type="dxa"/>
-            </w:tcMar>
-            <w:vAlign w:val="center"/>
-          </w:tcPr>
-          <w:p>
-            <w:pPr>
-              <w:spacing w:after="0" w:before="0" w:lineRule="auto"/>
-              <w:rPr/>
-            </w:pPr>
-            <w:r>
-              <w:rPr>
-                <w:rtl w:val="0"/>
-              </w:rPr>
-            </w:r>
-          </w:p>
-        </w:tc>
-      </w:tr>
     </w:tbl>
     <w:p>
       <w:pPr>
@@ -2041,9 +1953,6 @@
       <w:pPr>
         <w:rPr/>
       </w:pPr>
-      <w:r>
-        <w:br w:type="page"/>
-      </w:r>
       <w:r>
         <w:rPr>
           <w:rtl w:val="0"/>

</xml_diff>